<commit_message>
Add public project URL to coursework references
</commit_message>
<xml_diff>
--- a/coursework/Курсовая_ТрекЛист.docx
+++ b/coursework/Курсовая_ТрекЛист.docx
@@ -13625,6 +13625,36 @@
           <w:color w:val="000000"/>
         </w:rPr>
         <w:t xml:space="preserve">11. Учебные материалы по Kotlin, Jetpack Compose, архитектуре, навигации, многопоточности, сетевому взаимодействию, хранению данных и проверке проекта. Лекции 1–11 и практические работы 1–5, 9–12, предоставленные для выполнения работы [Электронные документы].</w:t>
+      </w:r>
+    </w:p>
+    <w:p>
+      <w:pPr>
+        <w:ind w:firstLine="708"/>
+        <w:rPr>
+          <w:rFonts w:cs="Times New Roman"/>
+          <w:szCs w:val="28"/>
+        </w:rPr>
+        <w:widowControl/>
+      </w:pPr>
+      <w:r>
+        <w:rPr>
+          <w:color w:val="000000"/>
+        </w:rPr>
+        <w:t xml:space="preserve">12. Defyzer. ТрекЛист: исходный код мобильного приложения и материалы курсовой работы [Электронный ресурс]. GitHub. URL: </w:t>
+      </w:r>
+      <w:hyperlink r:id="rIdTrackListGitHubSource" w:history="1">
+        <w:r>
+          <w:rPr>
+            <w:color w:val="000000"/>
+          </w:rPr>
+          <w:t xml:space="preserve">https://github.com/Defyzer/TrackList</w:t>
+        </w:r>
+      </w:hyperlink>
+      <w:r>
+        <w:rPr>
+          <w:color w:val="000000"/>
+        </w:rPr>
+        <w:t xml:space="preserve"> (дата обращения: 27.10.2026).</w:t>
       </w:r>
     </w:p>
     <w:sectPr>

</xml_diff>